<commit_message>
SSLC consent/bylaw: align to SSLC Bylaws (Art II §10/§12, Art IX §1), Article X numbering, $60K resolved per Exos QB
</commit_message>
<xml_diff>
--- a/drafts/SSLC_Shareholder_Written_Consent_and_Bylaw_DRAFT_2026-10-12.docx
+++ b/drafts/SSLC_Shareholder_Written_Consent_and_Bylaw_DRAFT_2026-10-12.docx
@@ -79,7 +79,33 @@
           <w:i w:val="0"/>
           <w:sz w:val="20"/>
         </w:rPr>
-        <w:t>•  Open items before use: (a) confirm SSLC's Articles do not prohibit action by written consent (Cal. Corp. Code §603(a)); (b) get the current bylaws to set the Article number; (c) confirm no proxy revocation (John: none received as of 10/12/2026); (d) Exos $60K (10/10/2024): if it is part of the $790K equity behind 18.06%, it cannot also be a $31.2K loan still due. Pick one before signing.</w:t>
+        <w:t>•  Checked against SSLC Bylaws (adopted June 2000; data-room/SSLC/governance/SSLC_1a_Bylaws.pdf): Art. II §10 expressly permits shareholder action by written consent of a majority of outstanding shares and recognizes proxyholders; Art. IX §1 lets holders of a majority of outstanding shares adopt or amend bylaws. The new Article is numbered X (existing Articles I-IX).</w:t>
+      </w:r>
+    </w:p>
+    <w:p>
+      <w:pPr>
+        <w:spacing w:after="80"/>
+      </w:pPr>
+      <w:r>
+        <w:rPr>
+          <w:b w:val="0"/>
+          <w:i w:val="0"/>
+          <w:sz w:val="20"/>
+        </w:rPr>
+        <w:t>•  Open items before use: (a) SSLC Articles of Incorporation are not in the data room. Order a certified copy from the CA Secretary of State to confirm they do not restrict written consent (§603(a)) or fix the board size; (b) Bylaws Art. II §12 requires a proxy to be 'filed with the secretary': deliver the Microcosm proxy to the Secretary with (or before) the consents; (c) confirm the current Secretary (the 2000 certificate is signed by Alice V. Wertz) and deliver consents to the Secretary AND every director by trackable means; (d) record date for this consent = the day the first consent is signed (Bylaws Art. II §11(b)). Sign Exos's consent last, on the day all are delivered.</w:t>
+      </w:r>
+    </w:p>
+    <w:p>
+      <w:pPr>
+        <w:spacing w:after="80"/>
+      </w:pPr>
+      <w:r>
+        <w:rPr>
+          <w:b w:val="0"/>
+          <w:i w:val="0"/>
+          <w:sz w:val="20"/>
+        </w:rPr>
+        <w:t>•  Exos $60K resolved (Exos QuickBooks, 10/12/2026): the $790K 'Scorpius Stock' = $450K (Nov 2021) + $60K (12/21/2023) + $250K (Mar-Apr 2024) + $30K loan converted (7/24/2024). The 10/10/2024 $60K is a SEPARATE loan (SSLC repaid $28.8K; $31.2K still due). The 18.06% and the loan are both valid.</w:t>
       </w:r>
     </w:p>
     <w:p>
@@ -294,7 +320,7 @@
           <w:b w:val="0"/>
           <w:i w:val="0"/>
         </w:rPr>
-        <w:t>RESOLVED, that pursuant to Section 211 of the California Corporations Code, the Bylaws of the Corporation are amended to add a new Article [__] titled "Financial Integrity and Related-Party Transactions" in the form attached as Exhibit A, effective on the Effective Date.</w:t>
+        <w:t>RESOLVED, that pursuant to Article IX, Section 1 of the Bylaws and Section 211 of the California Corporations Code, the Bylaws of the Corporation are amended to add a new Article X titled "Financial Integrity and Related-Party Transactions" in the form attached as Exhibit A, effective on the Effective Date.</w:t>
       </w:r>
     </w:p>
     <w:p>
@@ -319,7 +345,7 @@
           <w:b w:val="0"/>
           <w:i w:val="0"/>
         </w:rPr>
-        <w:t>RESOLVED, that the officers of the Corporation are directed to carry out the Independent Reconciliation required by Section [__].4 of Exhibit A, and to deliver its report to every director and to any shareholder who requests it.</w:t>
+        <w:t>RESOLVED, that the officers of the Corporation are directed to carry out the Independent Reconciliation required by Section 10.4 of Exhibit A, and to deliver its report to every director and to any shareholder who requests it.</w:t>
       </w:r>
     </w:p>
     <w:p>
@@ -965,7 +991,7 @@
           <w:i w:val="0"/>
           <w:sz w:val="24"/>
         </w:rPr>
-        <w:t>ARTICLE [__]: FINANCIAL INTEGRITY AND RELATED-PARTY TRANSACTIONS</w:t>
+        <w:t>ARTICLE X: FINANCIAL INTEGRITY AND RELATED-PARTY TRANSACTIONS</w:t>
       </w:r>
     </w:p>
     <w:p>
@@ -976,7 +1002,7 @@
         <w:rPr>
           <w:b/>
         </w:rPr>
-        <w:t xml:space="preserve">[__].1 Definitions. </w:t>
+        <w:t xml:space="preserve">10.1 Definitions. </w:t>
       </w:r>
       <w:r>
         <w:t>"Related Party" means (a) any director or officer of the Corporation; (b) any holder of 10% or more of the Corporation's outstanding shares; (c) any spouse, child, parent or sibling of a person in (a) or (b); and (d) any entity in which a person in (a) through (c) holds a material financial interest or serves as a director or officer, including without limitation Microcosm, Inc. and Microcosm Astronautics Books. "Related-Party Transaction" means any payment, loan, advance, guarantee, lease, cost allocation, reclassification, interest accrual, set-off, netting, forgiveness or other transfer of value between the Corporation and a Related Party. "Disinterested Director" means a director who is not, and has no material financial interest in, a party to the transaction.</w:t>
@@ -990,7 +1016,7 @@
         <w:rPr>
           <w:b/>
         </w:rPr>
-        <w:t xml:space="preserve">[__].2 Approval Required. </w:t>
+        <w:t xml:space="preserve">10.2 Approval Required. </w:t>
       </w:r>
       <w:r>
         <w:t>No Related-Party Transaction shall be entered into, paid, recorded or modified unless (a) the material facts, including written invoices or agreements supporting the amount, are disclosed to all directors, and (b) it is approved by a majority of the Disinterested Directors (who may not be fewer than two) in a manner meeting Section 310(a)(2) of the California Corporations Code, or by the shareholders under Section 310(a)(1) with the shares owned by the interested Related Party not being entitled to vote. Ordinary payroll to an employee who is a Related Party at rates previously so approved does not require further approval.</w:t>
@@ -1004,7 +1030,7 @@
         <w:rPr>
           <w:b/>
         </w:rPr>
-        <w:t xml:space="preserve">[__].3 Freeze Pending Reconciliation. </w:t>
+        <w:t xml:space="preserve">10.3 Freeze Pending Reconciliation. </w:t>
       </w:r>
       <w:r>
         <w:t>Until the Independent Reconciliation report has been delivered and its adjustments recorded, the Corporation shall not (a) repay, net, offset, increase or accrue interest on any amount recorded as owed to a Related Party, or (b) make any distribution to shareholders.</w:t>
@@ -1018,7 +1044,7 @@
         <w:rPr>
           <w:b/>
         </w:rPr>
-        <w:t xml:space="preserve">[__].4 Independent Reconciliation. </w:t>
+        <w:t xml:space="preserve">10.4 Independent Reconciliation. </w:t>
       </w:r>
       <w:r>
         <w:t>Within 15 days after this Article takes effect, the Disinterested Directors shall engage an independent certified public accounting firm that has not, within the prior three years, been engaged by any Related Party or worked at the direction of any Related Party (the "Reviewer"). The Reviewer shall, within 45 days after engagement, reconcile and report on: (a) accounts receivable unbilled (account 1110) and customer deposits (account 2380), tank by tank, against customer purchase orders, invoices, billing milestones and deliveries; (b) all balances owed to or by Microcosm, Inc. and Microcosm Astronautics Books, including the entries recorded on or about April 30, 2026, with supporting invoices and agreements; (c) the allocation of facility rent, utilities, software, office and shared services between the Corporation and any Related Party from January 1, 2024; (d) all amounts paid to any Related Party from July 1, 2024; and (e) the share register against issued certificates and paid-in capital by holder. The Corporation shall record the Reviewer's adjustments within 10 days after receiving the report.</w:t>
@@ -1032,10 +1058,10 @@
         <w:rPr>
           <w:b/>
         </w:rPr>
-        <w:t xml:space="preserve">[__].5 Director Access. </w:t>
+        <w:t xml:space="preserve">10.5 Director Access. </w:t>
       </w:r>
       <w:r>
-        <w:t>Every director shall receive, within three business days after written request, read-only access to the Corporation's accounting system and supporting records, consistent with Section 1602 of the California Corporations Code. No officer, employee or contractor of the Corporation shall restrict or delay that access.</w:t>
+        <w:t>Every director shall receive, within three business days after written request, read-only access to the Corporation's accounting system and supporting records, consistent with Article V, Section 10 and Article VII, Section 4 of these Bylaws and Section 1602 of the California Corporations Code. No officer, employee or contractor of the Corporation shall restrict or delay that access.</w:t>
       </w:r>
     </w:p>
     <w:p>
@@ -1046,7 +1072,7 @@
         <w:rPr>
           <w:b/>
         </w:rPr>
-        <w:t xml:space="preserve">[__].6 Share Register. </w:t>
+        <w:t xml:space="preserve">10.6 Share Register. </w:t>
       </w:r>
       <w:r>
         <w:t>The Secretary shall maintain the share register reconciled to the certificates issued and shall furnish it to any shareholder on written request within 10 days.</w:t>
@@ -1060,7 +1086,7 @@
         <w:rPr>
           <w:b/>
         </w:rPr>
-        <w:t xml:space="preserve">[__].7 Amendment. </w:t>
+        <w:t xml:space="preserve">10.7 Amendment. </w:t>
       </w:r>
       <w:r>
         <w:t>This Article may be amended or repealed only by approval of the outstanding shares (Section 152 of the California Corporations Code), and the Board shall have no power to amend or repeal it.</w:t>

</xml_diff>

<commit_message>
SSLC consent: checked against Articles (1999) + 2025/2026 Statements of Information; board route note
</commit_message>
<xml_diff>
--- a/drafts/SSLC_Shareholder_Written_Consent_and_Bylaw_DRAFT_2026-10-12.docx
+++ b/drafts/SSLC_Shareholder_Written_Consent_and_Bylaw_DRAFT_2026-10-12.docx
@@ -92,7 +92,33 @@
           <w:i w:val="0"/>
           <w:sz w:val="20"/>
         </w:rPr>
-        <w:t>•  Open items before use: (a) SSLC Articles of Incorporation are not in the data room. Order a certified copy from the CA Secretary of State to confirm they do not restrict written consent (§603(a)) or fix the board size; (b) Bylaws Art. II §12 requires a proxy to be 'filed with the secretary': deliver the Microcosm proxy to the Secretary with (or before) the consents; (c) confirm the current Secretary (the 2000 certificate is signed by Alice V. Wertz) and deliver consents to the Secretary AND every director by trackable means; (d) record date for this consent = the day the first consent is signed (Bylaws Art. II §11(b)). Sign Exos's consent last, on the day all are delivered.</w:t>
+        <w:t>•  Checked against SSLC Articles of Incorporation (filed 1/19/1999, Entity No. 2131102) and the Certificate of Amendment (filed 3/22/1999): one class of shares, 6,000,000 authorized; no restriction on shareholder written consent; no board size stated (so Bylaws Art. III §2 governs: 5-9 directors). Statements of Information filed 1/27/2025 and 1/18/2026: 5 directors, 0 vacancies (John Quinn, Markus Rufer, Robert Conger, Alice Wertz, James Wertz); Rufer CEO; Alice Wertz Secretary and CFO.</w:t>
+      </w:r>
+    </w:p>
+    <w:p>
+      <w:pPr>
+        <w:spacing w:after="80"/>
+      </w:pPr>
+      <w:r>
+        <w:rPr>
+          <w:b w:val="0"/>
+          <w:i w:val="0"/>
+          <w:sz w:val="20"/>
+        </w:rPr>
+        <w:t>•  Board route first: on related-party matters Jim and Alice Wertz are interested directors, so Quinn + Rufer + Conger are 3 of 5 (a quorum and a majority). Any two directors can call a special board meeting (Bylaws Art. III §8), and the board can remove or replace officers, including the CFO/Secretary, with or without cause (Art. V §4). Use this consent if Rufer or Conger will not vote at the board level.</w:t>
+      </w:r>
+    </w:p>
+    <w:p>
+      <w:pPr>
+        <w:spacing w:after="80"/>
+      </w:pPr>
+      <w:r>
+        <w:rPr>
+          <w:b w:val="0"/>
+          <w:i w:val="0"/>
+          <w:sz w:val="20"/>
+        </w:rPr>
+        <w:t>•  Before use: (a) Bylaws Art. II §12 requires a proxy to be 'filed with the secretary': deliver the Microcosm proxy to the Secretary (Alice Wertz) with or before the consents; (b) deliver consents to the Secretary AND every director by trackable means; (c) record date for this consent = the day the first consent is signed (Bylaws Art. II §11(b)). Sign Exos's consent last, on the day all are delivered.</w:t>
       </w:r>
     </w:p>
     <w:p>
@@ -131,7 +157,7 @@
           <w:i w:val="0"/>
           <w:sz w:val="20"/>
         </w:rPr>
-        <w:t>•  Not legal advice. Sources: Cal. Corp. Code §603 (written consent), §705 (proxies), §211 (shareholder bylaw amendment), §310 (interested-director transactions), §1602 (director inspection); california.public.law.</w:t>
+        <w:t>•  Not legal advice. Sources: Cal. Corp. Code §603 (written consent), §705 (proxies), §211 (shareholder bylaw amendment), §310 (interested-director transactions), §1602 (director inspection); california.public.law. SSLC Articles, amendment and Statements of Information: data-room/SSLC/governance/.</w:t>
       </w:r>
     </w:p>
     <w:p>

</xml_diff>